<commit_message>
update data: - cào đầy đủ dữ liệu hơn ( 1950 thủ tục - tổng số thủ tục thuộc quản lý của tỉnh Lai Châu) - thay đổi dữ liệu trong entities.json dựa theo procedures.json - thêm một chút trường hợp rào trong intents.json - thêm file all_laichau_codes.json (file chứa mã thủ tục và id của thủ tục phụ trách cho việc cào thủ tục từ trang chủ https://dichvucong.gov.vn/) - thêm file getData.py (phụ trách việc cào dữ liệu dựa trên mã thủ tục và id được cung cấp từ all_laichau_codes.json)
</commit_message>
<xml_diff>
--- a/temp/Báo cáo.docx
+++ b/temp/Báo cáo.docx
@@ -67,7 +67,14 @@
           <w:rFonts w:cs="Times New Roman"/>
           <w:szCs w:val="26"/>
         </w:rPr>
-        <w:t>Trong bối cảnh tỉnh Lai Châu đang đẩy mạnh chuyển đổi số, việc tiếp cận các thủ tục hành chính của người dân vẫn còn khoảng cách do địa hình và sự phân tán thông tin. Các hệ thống hiện tại chủ yếu là trang web tĩnh, gây khó khăn cho những người không am hiểu công nghệ. Vì vậy, việc xây dựng một trợ lý ảo có khả năng giao tiếp tự nhiên là vô cùng cấp thiết.</w:t>
+        <w:t>Trong bối cảnh đẩy mạnh tiến trình chuyển đổi số quốc gia, tỉnh Lai Châu đã và đang tập trung nguồn lực để xây dựng chính quyền số nhằm nâng cao hiệu quả quản lý và phục vụ nhân dân. Tuy nhiên, thực tế cho thấy việc tiếp cận các dịch vụ công vẫn tồn tại những rào cản nhất định. Với đặc thù địa hình miền núi phức tạp và dân cư phân tán, việc người dân phải trực tiếp đến bộ phận "một cửa" để tìm hiểu thông tin gây ra sự lãng phí về thời gian và công sức.</w:t>
+      </w:r>
+      <w:r>
+        <w:rPr>
+          <w:rFonts w:cs="Times New Roman"/>
+          <w:szCs w:val="26"/>
+        </w:rPr>
+        <w:t xml:space="preserve"> </w:t>
       </w:r>
     </w:p>
     <w:p>
@@ -85,7 +92,7 @@
           <w:rFonts w:cs="Times New Roman"/>
           <w:szCs w:val="26"/>
         </w:rPr>
-        <w:t>Bên cạnh đó, các hệ thống hiện tại chủ yếu cung cấp thông tin dạng tĩnh, chưa hỗ trợ tương tác thông minh để trả lời câu hỏi cụ thể của người dùng. Điều này gây mất thời gian và làm giảm hiệu quả tiếp cận dịch vụ công.</w:t>
+        <w:t xml:space="preserve">Hiện tại, các hệ thống tra cứu thủ tục hành chính chủ yếu tồn tại dưới dạng trang web tĩnh với khối lượng văn bản pháp quy khổng lồ, ngôn ngữ chuyên ngành khô khan, gây khó khăn cho những người không am hiểu sâu về công nghệ hoặc quy trình pháp lý. Do đó, nhu cầu về một công cụ tương tác thông minh, có khả năng giải đáp trực tiếp các thắc mắc cụ thể của người dân bằng ngôn ngữ tự nhiên là vô cùng cấp thiết. </w:t>
       </w:r>
     </w:p>
     <w:p>
@@ -103,7 +110,7 @@
           <w:rFonts w:cs="Times New Roman"/>
           <w:szCs w:val="26"/>
         </w:rPr>
-        <w:t>Xuất phát từ thực tế đó, đề tài “Xây dựng chatbot tra cứu thủ tục hành chính sử dụng kỹ thuật RAG kết hợp xử lý ngôn ngữ tự nhiên” được lựa chọn nhằm hỗ trợ người dùng tra cứu nhanh chóng, chính xác và trực quan hơn.</w:t>
+        <w:t>Xuất phát từ thực tế đó, đề tài “Xây dựng chatbot tra cứu thủ tục hành chính sử dụng kỹ thuật RAG kết hợp xử lý ngôn ngữ tự nhiên” được thực hiện nhằm cung cấp một giải pháp tra cứu hiện đại, hỗ trợ người dân tiếp cận thông tin hành chính một cách chính xác, minh bạch và thân thiện hơn.</w:t>
       </w:r>
     </w:p>
     <w:p>
@@ -165,14 +172,32 @@
         <w:rPr>
           <w:rFonts w:cs="Times New Roman"/>
           <w:szCs w:val="26"/>
-        </w:rPr>
-      </w:pPr>
-      <w:r>
-        <w:rPr>
-          <w:rFonts w:cs="Times New Roman"/>
-          <w:szCs w:val="26"/>
-        </w:rPr>
-        <w:t>Xây dựng một hệ thống chatbot có khả năng tra cứu và trả lời thông tin thủ tục hành chính một cách tự động, chính xác và thân thiện với người dùng.</w:t>
+          <w:lang w:val="vi-VN"/>
+        </w:rPr>
+      </w:pPr>
+      <w:r>
+        <w:rPr>
+          <w:rFonts w:cs="Times New Roman"/>
+          <w:szCs w:val="26"/>
+          <w:lang w:val="vi-VN"/>
+        </w:rPr>
+        <w:t>Nghiên cứu và triển khai một hệ thống chatbot trợ lý ảo có khả năng hiểu, truy xuất và phản hồi thông tin về thủ tục hành chính một cách tự động, đảm bảo độ tin cậy cao và trải nghiệm người dùng tố</w:t>
+      </w:r>
+      <w:r>
+        <w:rPr>
+          <w:rFonts w:cs="Times New Roman"/>
+          <w:szCs w:val="26"/>
+          <w:lang w:val="vi-VN"/>
+        </w:rPr>
+        <w:t>i ưu</w:t>
+      </w:r>
+      <w:r>
+        <w:rPr>
+          <w:rFonts w:cs="Times New Roman"/>
+          <w:szCs w:val="26"/>
+          <w:lang w:val="vi-VN"/>
+        </w:rPr>
+        <w:t>.</w:t>
       </w:r>
     </w:p>
     <w:p>
@@ -193,16 +218,178 @@
           <w:i/>
           <w:szCs w:val="26"/>
         </w:rPr>
-        <w:t>Mục tiêu cụ thể</w:t>
-      </w:r>
-      <w:r>
+        <w:t>Mục tiêu cụ thể:</w:t>
+      </w:r>
+    </w:p>
+    <w:p>
+      <w:pPr>
+        <w:pStyle w:val="ListParagraph"/>
+        <w:numPr>
+          <w:ilvl w:val="0"/>
+          <w:numId w:val="7"/>
+        </w:numPr>
+        <w:rPr>
+          <w:rFonts w:cs="Times New Roman"/>
+          <w:szCs w:val="26"/>
+          <w:lang w:val="vi-VN"/>
+        </w:rPr>
+      </w:pPr>
+      <w:r>
+        <w:rPr>
+          <w:rFonts w:cs="Times New Roman"/>
+          <w:szCs w:val="26"/>
+          <w:lang w:val="vi-VN"/>
+        </w:rPr>
+        <w:t>Xây dựng hệ thống thu thập và chuẩn hóa dữ liệu thủ tục hành chính từ nguồn thực</w:t>
+      </w:r>
+      <w:r>
+        <w:rPr>
+          <w:rFonts w:cs="Times New Roman"/>
+          <w:szCs w:val="26"/>
+          <w:lang w:val="vi-VN"/>
+        </w:rPr>
+        <w:t>.</w:t>
+      </w:r>
+      <w:bookmarkStart w:id="10" w:name="_GoBack"/>
+      <w:bookmarkEnd w:id="10"/>
+    </w:p>
+    <w:p>
+      <w:pPr>
+        <w:pStyle w:val="ListParagraph"/>
+        <w:numPr>
+          <w:ilvl w:val="0"/>
+          <w:numId w:val="7"/>
+        </w:numPr>
+        <w:rPr>
+          <w:rFonts w:cs="Times New Roman"/>
+          <w:szCs w:val="26"/>
+          <w:lang w:val="vi-VN"/>
+        </w:rPr>
+      </w:pPr>
+      <w:r>
+        <w:rPr>
+          <w:rFonts w:cs="Times New Roman"/>
+          <w:szCs w:val="26"/>
+          <w:lang w:val="vi-VN"/>
+        </w:rPr>
+        <w:t>Thiết kế cơ chế chunking và lưu trữ dữ liệu vào vector database</w:t>
+      </w:r>
+      <w:r>
+        <w:rPr>
+          <w:rFonts w:cs="Times New Roman"/>
+          <w:szCs w:val="26"/>
+          <w:lang w:val="vi-VN"/>
+        </w:rPr>
+        <w:t>.</w:t>
+      </w:r>
+    </w:p>
+    <w:p>
+      <w:pPr>
+        <w:pStyle w:val="ListParagraph"/>
+        <w:numPr>
+          <w:ilvl w:val="0"/>
+          <w:numId w:val="7"/>
+        </w:numPr>
+        <w:rPr>
+          <w:rFonts w:cs="Times New Roman"/>
+          <w:szCs w:val="26"/>
+        </w:rPr>
+      </w:pPr>
+      <w:r>
+        <w:rPr>
+          <w:rFonts w:cs="Times New Roman"/>
+          <w:szCs w:val="26"/>
+        </w:rPr>
+        <w:t>Xây dựng pipeline RAG (Retrieval-Augmented Generation) để truy vấn và trả lời</w:t>
+      </w:r>
+      <w:r>
+        <w:rPr>
+          <w:rFonts w:cs="Times New Roman"/>
+          <w:szCs w:val="26"/>
+        </w:rPr>
+        <w:t>.</w:t>
+      </w:r>
+    </w:p>
+    <w:p>
+      <w:pPr>
+        <w:pStyle w:val="ListParagraph"/>
+        <w:numPr>
+          <w:ilvl w:val="0"/>
+          <w:numId w:val="7"/>
+        </w:numPr>
+        <w:rPr>
+          <w:rFonts w:cs="Times New Roman"/>
+          <w:szCs w:val="26"/>
+        </w:rPr>
+      </w:pPr>
+      <w:r>
+        <w:rPr>
+          <w:rFonts w:cs="Times New Roman"/>
+          <w:szCs w:val="26"/>
+        </w:rPr>
+        <w:t>Tích hợp các mô hình ngôn ngữ lớn (LLM) để nâng cao khả năng suy luận và hiểu ngữ cảnh hội thoại.</w:t>
+      </w:r>
+    </w:p>
+    <w:p>
+      <w:pPr>
+        <w:pStyle w:val="ListParagraph"/>
+        <w:numPr>
+          <w:ilvl w:val="0"/>
+          <w:numId w:val="7"/>
+        </w:numPr>
+        <w:rPr>
+          <w:rFonts w:cs="Times New Roman"/>
+          <w:szCs w:val="26"/>
+        </w:rPr>
+      </w:pPr>
+      <w:r>
+        <w:rPr>
+          <w:rFonts w:cs="Times New Roman"/>
+          <w:szCs w:val="26"/>
+        </w:rPr>
+        <w:lastRenderedPageBreak/>
+        <w:t>Phát triển chức năng quản lý lịch sử trò chuyện (Conversation Memory) và triển khai hệ thống Backend API bền vững.</w:t>
+      </w:r>
+    </w:p>
+    <w:p>
+      <w:pPr>
+        <w:pStyle w:val="ListParagraph"/>
+        <w:numPr>
+          <w:ilvl w:val="0"/>
+          <w:numId w:val="6"/>
+        </w:numPr>
+        <w:ind w:left="357" w:hanging="357"/>
+        <w:outlineLvl w:val="1"/>
+        <w:rPr>
+          <w:b/>
+        </w:rPr>
+      </w:pPr>
+      <w:r>
+        <w:rPr>
+          <w:b/>
+        </w:rPr>
+        <w:t>Đối tượng và phạm vi nghiên cứu</w:t>
+      </w:r>
+    </w:p>
+    <w:p>
+      <w:pPr>
+        <w:spacing w:after="0" w:line="360" w:lineRule="auto"/>
+        <w:jc w:val="both"/>
         <w:rPr>
           <w:rFonts w:cs="Times New Roman"/>
           <w:b/>
           <w:i/>
           <w:szCs w:val="26"/>
         </w:rPr>
-        <w:t>:</w:t>
+      </w:pPr>
+      <w:r>
+        <w:rPr>
+          <w:rFonts w:cs="Times New Roman"/>
+          <w:b/>
+          <w:i/>
+          <w:szCs w:val="26"/>
+        </w:rPr>
+        <w:t>Đối tượng nghiên cứu:</w:t>
       </w:r>
     </w:p>
     <w:p>
@@ -220,19 +407,9 @@
       </w:pPr>
       <w:r>
         <w:rPr>
-          <w:rFonts w:cs="Times New Roman"/>
-          <w:szCs w:val="26"/>
-          <w:lang w:val="vi-VN"/>
-        </w:rPr>
-        <w:t>Xây dựng hệ thống thu thập và chuẩn hóa dữ liệu thủ tục hành chính từ nguồn thực</w:t>
-      </w:r>
-      <w:r>
-        <w:rPr>
-          <w:rFonts w:cs="Times New Roman"/>
-          <w:szCs w:val="26"/>
-          <w:lang w:val="vi-VN"/>
-        </w:rPr>
-        <w:t>;</w:t>
+          <w:lang w:val="vi-VN"/>
+        </w:rPr>
+        <w:t>Người dân và cán bộ thực hiện thủ tục hành chính</w:t>
       </w:r>
     </w:p>
     <w:p>
@@ -254,7 +431,7 @@
           <w:szCs w:val="26"/>
           <w:lang w:val="vi-VN"/>
         </w:rPr>
-        <w:t>Thiết kế cơ chế chunking và lưu trữ dữ liệu vào vector database</w:t>
+        <w:t>Dữ liệu thủ tục hành chính (cấu trúc JSON)</w:t>
       </w:r>
       <w:r>
         <w:rPr>
@@ -275,19 +452,22 @@
         <w:rPr>
           <w:rFonts w:cs="Times New Roman"/>
           <w:szCs w:val="26"/>
-        </w:rPr>
-      </w:pPr>
-      <w:r>
-        <w:rPr>
-          <w:rFonts w:cs="Times New Roman"/>
-          <w:szCs w:val="26"/>
-        </w:rPr>
-        <w:t>Xây dựng pipeline RAG (Retrieval-Augmented Generation) để truy vấn và trả lời</w:t>
-      </w:r>
-      <w:r>
-        <w:rPr>
-          <w:rFonts w:cs="Times New Roman"/>
-          <w:szCs w:val="26"/>
+          <w:lang w:val="vi-VN"/>
+        </w:rPr>
+      </w:pPr>
+      <w:r>
+        <w:rPr>
+          <w:rFonts w:cs="Times New Roman"/>
+          <w:szCs w:val="26"/>
+          <w:lang w:val="vi-VN"/>
+        </w:rPr>
+        <w:t>Các kỹ thuật xử lý ngôn ngữ tự nhiên (NLP)</w:t>
+      </w:r>
+      <w:r>
+        <w:rPr>
+          <w:rFonts w:cs="Times New Roman"/>
+          <w:szCs w:val="26"/>
+          <w:lang w:val="vi-VN"/>
         </w:rPr>
         <w:t>;</w:t>
       </w:r>
@@ -309,7 +489,7 @@
           <w:rFonts w:cs="Times New Roman"/>
           <w:szCs w:val="26"/>
         </w:rPr>
-        <w:t>Tích hợp mô hình ngôn ngữ lớn (LLM) để cải thiện khả năng hiểu ngữ cảnh</w:t>
+        <w:t>Mô hình RAG và vector database</w:t>
       </w:r>
       <w:r>
         <w:rPr>
@@ -336,12 +516,63 @@
           <w:rFonts w:cs="Times New Roman"/>
           <w:szCs w:val="26"/>
         </w:rPr>
-        <w:t>Xây dựng chức năng ghi nhớ hội thoại (conversation memory)</w:t>
-      </w:r>
-      <w:r>
-        <w:rPr>
-          <w:rFonts w:cs="Times New Roman"/>
-          <w:szCs w:val="26"/>
+        <w:t>Hệ thống chatbot tương tác người dùng</w:t>
+      </w:r>
+      <w:r>
+        <w:rPr>
+          <w:rFonts w:cs="Times New Roman"/>
+          <w:szCs w:val="26"/>
+        </w:rPr>
+        <w:t>.</w:t>
+      </w:r>
+    </w:p>
+    <w:p>
+      <w:pPr>
+        <w:spacing w:after="0" w:line="360" w:lineRule="auto"/>
+        <w:jc w:val="both"/>
+        <w:rPr>
+          <w:rFonts w:cs="Times New Roman"/>
+          <w:b/>
+          <w:i/>
+          <w:szCs w:val="26"/>
+        </w:rPr>
+      </w:pPr>
+      <w:r>
+        <w:rPr>
+          <w:rFonts w:cs="Times New Roman"/>
+          <w:b/>
+          <w:i/>
+          <w:szCs w:val="26"/>
+        </w:rPr>
+        <w:t>Phạm vi nghiên cứu:</w:t>
+      </w:r>
+    </w:p>
+    <w:p>
+      <w:pPr>
+        <w:pStyle w:val="ListParagraph"/>
+        <w:numPr>
+          <w:ilvl w:val="0"/>
+          <w:numId w:val="12"/>
+        </w:numPr>
+        <w:rPr>
+          <w:rFonts w:cs="Times New Roman"/>
+          <w:szCs w:val="26"/>
+          <w:lang w:val="vi-VN"/>
+        </w:rPr>
+      </w:pPr>
+      <w:r>
+        <w:rPr>
+          <w:rFonts w:cs="Times New Roman"/>
+          <w:szCs w:val="26"/>
+          <w:lang w:val="vi-VN"/>
+        </w:rPr>
+        <w:t>Tập trung vào tra cứu thủ tục hành chính cấp tỉnh/cấp trung ương</w:t>
+      </w:r>
+      <w:r>
+        <w:rPr>
+          <w:rFonts w:cs="Times New Roman"/>
+          <w:szCs w:val="26"/>
+          <w:lang w:val="vi-VN"/>
         </w:rPr>
         <w:t>;</w:t>
       </w:r>
@@ -351,24 +582,107 @@
         <w:pStyle w:val="ListParagraph"/>
         <w:numPr>
           <w:ilvl w:val="0"/>
-          <w:numId w:val="7"/>
-        </w:numPr>
-        <w:rPr>
-          <w:rFonts w:cs="Times New Roman"/>
-          <w:szCs w:val="26"/>
-        </w:rPr>
-      </w:pPr>
-      <w:r>
-        <w:rPr>
-          <w:rFonts w:cs="Times New Roman"/>
-          <w:szCs w:val="26"/>
-        </w:rPr>
-        <w:t>Triển khai API backend phục vụ chatbot</w:t>
-      </w:r>
-      <w:r>
-        <w:rPr>
-          <w:rFonts w:cs="Times New Roman"/>
-          <w:szCs w:val="26"/>
+          <w:numId w:val="12"/>
+        </w:numPr>
+        <w:rPr>
+          <w:rFonts w:cs="Times New Roman"/>
+          <w:szCs w:val="26"/>
+          <w:lang w:val="vi-VN"/>
+        </w:rPr>
+      </w:pPr>
+      <w:r>
+        <w:rPr>
+          <w:rFonts w:cs="Times New Roman"/>
+          <w:szCs w:val="26"/>
+          <w:lang w:val="vi-VN"/>
+        </w:rPr>
+        <w:t>Dữ liệu đầu vào được thu thập từ cổng dịch vụ công</w:t>
+      </w:r>
+      <w:r>
+        <w:rPr>
+          <w:rFonts w:cs="Times New Roman"/>
+          <w:szCs w:val="26"/>
+          <w:lang w:val="vi-VN"/>
+        </w:rPr>
+        <w:t>;</w:t>
+      </w:r>
+    </w:p>
+    <w:p>
+      <w:pPr>
+        <w:pStyle w:val="ListParagraph"/>
+        <w:numPr>
+          <w:ilvl w:val="0"/>
+          <w:numId w:val="12"/>
+        </w:numPr>
+        <w:rPr>
+          <w:rFonts w:cs="Times New Roman"/>
+          <w:szCs w:val="26"/>
+          <w:lang w:val="vi-VN"/>
+        </w:rPr>
+      </w:pPr>
+      <w:r>
+        <w:rPr>
+          <w:lang w:val="vi-VN"/>
+        </w:rPr>
+        <w:t>Tập trung vào nhóm thủ tục hành chính phổ biến (ví dụ: đất đai, tư pháp, hộ tịch) của tỉnh Lai Châu.</w:t>
+      </w:r>
+    </w:p>
+    <w:p>
+      <w:pPr>
+        <w:pStyle w:val="ListParagraph"/>
+        <w:numPr>
+          <w:ilvl w:val="0"/>
+          <w:numId w:val="12"/>
+        </w:numPr>
+        <w:rPr>
+          <w:rFonts w:cs="Times New Roman"/>
+          <w:szCs w:val="26"/>
+          <w:lang w:val="vi-VN"/>
+        </w:rPr>
+      </w:pPr>
+      <w:r>
+        <w:rPr>
+          <w:rFonts w:cs="Times New Roman"/>
+          <w:szCs w:val="26"/>
+          <w:lang w:val="vi-VN"/>
+        </w:rPr>
+        <w:t>Hệ thống chỉ xử lý văn bản, chưa xử lý giọng nói</w:t>
+      </w:r>
+      <w:r>
+        <w:rPr>
+          <w:rFonts w:cs="Times New Roman"/>
+          <w:szCs w:val="26"/>
+          <w:lang w:val="vi-VN"/>
+        </w:rPr>
+        <w:t>;</w:t>
+      </w:r>
+    </w:p>
+    <w:p>
+      <w:pPr>
+        <w:pStyle w:val="ListParagraph"/>
+        <w:numPr>
+          <w:ilvl w:val="0"/>
+          <w:numId w:val="12"/>
+        </w:numPr>
+        <w:rPr>
+          <w:rFonts w:cs="Times New Roman"/>
+          <w:szCs w:val="26"/>
+          <w:lang w:val="vi-VN"/>
+        </w:rPr>
+      </w:pPr>
+      <w:r>
+        <w:rPr>
+          <w:rFonts w:cs="Times New Roman"/>
+          <w:szCs w:val="26"/>
+          <w:lang w:val="vi-VN"/>
+        </w:rPr>
+        <w:t>Không triển khai ở quy mô sản phẩm thương mại</w:t>
+      </w:r>
+      <w:r>
+        <w:rPr>
+          <w:rFonts w:cs="Times New Roman"/>
+          <w:szCs w:val="26"/>
+          <w:lang w:val="vi-VN"/>
         </w:rPr>
         <w:t>.</w:t>
       </w:r>
@@ -384,13 +698,219 @@
         <w:outlineLvl w:val="1"/>
         <w:rPr>
           <w:b/>
+          <w:lang w:val="vi-VN"/>
         </w:rPr>
       </w:pPr>
       <w:r>
         <w:rPr>
           <w:b/>
         </w:rPr>
-        <w:t>Đối tượng và phạm vi nghiên cứu</w:t>
+        <w:t>Phương pháp nghiên cứu</w:t>
+      </w:r>
+    </w:p>
+    <w:p>
+      <w:pPr>
+        <w:pStyle w:val="ListParagraph"/>
+        <w:numPr>
+          <w:ilvl w:val="0"/>
+          <w:numId w:val="12"/>
+        </w:numPr>
+        <w:rPr>
+          <w:rFonts w:eastAsia="Times New Roman" w:cs="Times New Roman"/>
+          <w:szCs w:val="26"/>
+          <w:lang w:val="vi-VN"/>
+        </w:rPr>
+      </w:pPr>
+      <w:r>
+        <w:rPr>
+          <w:rFonts w:eastAsia="Times New Roman" w:cs="Times New Roman"/>
+          <w:szCs w:val="26"/>
+          <w:lang w:val="vi-VN"/>
+        </w:rPr>
+        <w:t xml:space="preserve">Phương pháp thu thập dữ liệu: </w:t>
+      </w:r>
+      <w:r>
+        <w:rPr>
+          <w:rFonts w:eastAsia="Times New Roman" w:cs="Times New Roman"/>
+          <w:szCs w:val="26"/>
+          <w:lang w:val="vi-VN"/>
+        </w:rPr>
+        <w:t>T</w:t>
+      </w:r>
+      <w:r>
+        <w:rPr>
+          <w:rFonts w:eastAsia="Times New Roman" w:cs="Times New Roman"/>
+          <w:szCs w:val="26"/>
+          <w:lang w:val="vi-VN"/>
+        </w:rPr>
+        <w:t>hu thập và chuẩn hóa dữ liệu thủ tục hành chính dạng JSON</w:t>
+      </w:r>
+      <w:r>
+        <w:rPr>
+          <w:rFonts w:eastAsia="Times New Roman" w:cs="Times New Roman"/>
+          <w:szCs w:val="26"/>
+          <w:lang w:val="vi-VN"/>
+        </w:rPr>
+        <w:t>;</w:t>
+      </w:r>
+    </w:p>
+    <w:p>
+      <w:pPr>
+        <w:pStyle w:val="ListParagraph"/>
+        <w:numPr>
+          <w:ilvl w:val="0"/>
+          <w:numId w:val="12"/>
+        </w:numPr>
+        <w:rPr>
+          <w:rFonts w:eastAsia="Times New Roman" w:cs="Times New Roman"/>
+          <w:szCs w:val="26"/>
+          <w:lang w:val="vi-VN"/>
+        </w:rPr>
+      </w:pPr>
+      <w:r>
+        <w:rPr>
+          <w:rFonts w:eastAsia="Times New Roman" w:cs="Times New Roman"/>
+          <w:szCs w:val="26"/>
+          <w:lang w:val="vi-VN"/>
+        </w:rPr>
+        <w:t xml:space="preserve">Phương pháp xử lý dữ liệu: </w:t>
+      </w:r>
+      <w:r>
+        <w:rPr>
+          <w:rFonts w:eastAsia="Times New Roman" w:cs="Times New Roman"/>
+          <w:szCs w:val="26"/>
+          <w:lang w:val="vi-VN"/>
+        </w:rPr>
+        <w:t>X</w:t>
+      </w:r>
+      <w:r>
+        <w:rPr>
+          <w:rFonts w:eastAsia="Times New Roman" w:cs="Times New Roman"/>
+          <w:szCs w:val="26"/>
+          <w:lang w:val="vi-VN"/>
+        </w:rPr>
+        <w:t>ây dựng cơ chế chunking theo từng trường thông tin (phí, hồ sơ, thời hạn,...)</w:t>
+      </w:r>
+      <w:r>
+        <w:rPr>
+          <w:rFonts w:eastAsia="Times New Roman" w:cs="Times New Roman"/>
+          <w:szCs w:val="26"/>
+          <w:lang w:val="vi-VN"/>
+        </w:rPr>
+        <w:t>;</w:t>
+      </w:r>
+    </w:p>
+    <w:p>
+      <w:pPr>
+        <w:pStyle w:val="ListParagraph"/>
+        <w:numPr>
+          <w:ilvl w:val="0"/>
+          <w:numId w:val="12"/>
+        </w:numPr>
+        <w:rPr>
+          <w:rFonts w:eastAsia="Times New Roman" w:cs="Times New Roman"/>
+          <w:szCs w:val="26"/>
+          <w:lang w:val="vi-VN"/>
+        </w:rPr>
+      </w:pPr>
+      <w:r>
+        <w:rPr>
+          <w:rFonts w:eastAsia="Times New Roman" w:cs="Times New Roman"/>
+          <w:szCs w:val="26"/>
+          <w:lang w:val="vi-VN"/>
+        </w:rPr>
+        <w:t xml:space="preserve">Phương pháp xây dựng hệ thống: </w:t>
+      </w:r>
+      <w:r>
+        <w:rPr>
+          <w:rFonts w:eastAsia="Times New Roman" w:cs="Times New Roman"/>
+          <w:szCs w:val="26"/>
+          <w:lang w:val="vi-VN"/>
+        </w:rPr>
+        <w:t>S</w:t>
+      </w:r>
+      <w:r>
+        <w:rPr>
+          <w:rFonts w:eastAsia="Times New Roman" w:cs="Times New Roman"/>
+          <w:szCs w:val="26"/>
+          <w:lang w:val="vi-VN"/>
+        </w:rPr>
+        <w:t>ử dụng kiến trúc RAG kết hợp vector database</w:t>
+      </w:r>
+      <w:r>
+        <w:rPr>
+          <w:rFonts w:eastAsia="Times New Roman" w:cs="Times New Roman"/>
+          <w:szCs w:val="26"/>
+          <w:lang w:val="vi-VN"/>
+        </w:rPr>
+        <w:t>;</w:t>
+      </w:r>
+    </w:p>
+    <w:p>
+      <w:pPr>
+        <w:pStyle w:val="ListParagraph"/>
+        <w:numPr>
+          <w:ilvl w:val="0"/>
+          <w:numId w:val="12"/>
+        </w:numPr>
+        <w:rPr>
+          <w:rFonts w:eastAsia="Times New Roman" w:cs="Times New Roman"/>
+          <w:szCs w:val="26"/>
+          <w:lang w:val="vi-VN"/>
+        </w:rPr>
+      </w:pPr>
+      <w:r>
+        <w:rPr>
+          <w:rFonts w:eastAsia="Times New Roman" w:cs="Times New Roman"/>
+          <w:szCs w:val="26"/>
+          <w:lang w:val="vi-VN"/>
+        </w:rPr>
+        <w:t xml:space="preserve">Phương pháp đánh giá: </w:t>
+      </w:r>
+      <w:r>
+        <w:rPr>
+          <w:rFonts w:eastAsia="Times New Roman" w:cs="Times New Roman"/>
+          <w:szCs w:val="26"/>
+          <w:lang w:val="vi-VN"/>
+        </w:rPr>
+        <w:t>K</w:t>
+      </w:r>
+      <w:r>
+        <w:rPr>
+          <w:rFonts w:eastAsia="Times New Roman" w:cs="Times New Roman"/>
+          <w:szCs w:val="26"/>
+          <w:lang w:val="vi-VN"/>
+        </w:rPr>
+        <w:t>iểm thử với các truy vấn thực tế và đo độ chính xác câu trả lời</w:t>
+      </w:r>
+      <w:r>
+        <w:rPr>
+          <w:rFonts w:eastAsia="Times New Roman" w:cs="Times New Roman"/>
+          <w:szCs w:val="26"/>
+          <w:lang w:val="vi-VN"/>
+        </w:rPr>
+        <w:t>.</w:t>
+      </w:r>
+    </w:p>
+    <w:p>
+      <w:pPr>
+        <w:pStyle w:val="ListParagraph"/>
+        <w:numPr>
+          <w:ilvl w:val="0"/>
+          <w:numId w:val="6"/>
+        </w:numPr>
+        <w:ind w:left="357" w:hanging="357"/>
+        <w:outlineLvl w:val="1"/>
+        <w:rPr>
+          <w:rFonts w:eastAsia="Times New Roman" w:cs="Times New Roman"/>
+          <w:szCs w:val="26"/>
+        </w:rPr>
+      </w:pPr>
+      <w:r>
+        <w:rPr>
+          <w:b/>
+        </w:rPr>
+        <w:t>Cấu trúc báo cáo</w:t>
       </w:r>
     </w:p>
     <w:p>
@@ -411,553 +931,6 @@
           <w:i/>
           <w:szCs w:val="26"/>
         </w:rPr>
-        <w:t>Đối tượng nghiên cứu:</w:t>
-      </w:r>
-    </w:p>
-    <w:p>
-      <w:pPr>
-        <w:pStyle w:val="ListParagraph"/>
-        <w:numPr>
-          <w:ilvl w:val="0"/>
-          <w:numId w:val="7"/>
-        </w:numPr>
-        <w:rPr>
-          <w:rFonts w:cs="Times New Roman"/>
-          <w:szCs w:val="26"/>
-          <w:lang w:val="vi-VN"/>
-        </w:rPr>
-      </w:pPr>
-      <w:r>
-        <w:rPr>
-          <w:lang w:val="vi-VN"/>
-        </w:rPr>
-        <w:t>Người dân và cán bộ thực hiện thủ tục hành chính</w:t>
-      </w:r>
-    </w:p>
-    <w:p>
-      <w:pPr>
-        <w:pStyle w:val="ListParagraph"/>
-        <w:numPr>
-          <w:ilvl w:val="0"/>
-          <w:numId w:val="7"/>
-        </w:numPr>
-        <w:rPr>
-          <w:rFonts w:cs="Times New Roman"/>
-          <w:szCs w:val="26"/>
-          <w:lang w:val="vi-VN"/>
-        </w:rPr>
-      </w:pPr>
-      <w:r>
-        <w:rPr>
-          <w:rFonts w:cs="Times New Roman"/>
-          <w:szCs w:val="26"/>
-          <w:lang w:val="vi-VN"/>
-        </w:rPr>
-        <w:t>Dữ liệu thủ tục hành chính (cấu trúc JSON)</w:t>
-      </w:r>
-      <w:r>
-        <w:rPr>
-          <w:rFonts w:cs="Times New Roman"/>
-          <w:szCs w:val="26"/>
-          <w:lang w:val="vi-VN"/>
-        </w:rPr>
-        <w:t>;</w:t>
-      </w:r>
-    </w:p>
-    <w:p>
-      <w:pPr>
-        <w:pStyle w:val="ListParagraph"/>
-        <w:numPr>
-          <w:ilvl w:val="0"/>
-          <w:numId w:val="7"/>
-        </w:numPr>
-        <w:rPr>
-          <w:rFonts w:cs="Times New Roman"/>
-          <w:szCs w:val="26"/>
-          <w:lang w:val="vi-VN"/>
-        </w:rPr>
-      </w:pPr>
-      <w:r>
-        <w:rPr>
-          <w:rFonts w:cs="Times New Roman"/>
-          <w:szCs w:val="26"/>
-          <w:lang w:val="vi-VN"/>
-        </w:rPr>
-        <w:t>Các kỹ thuật xử lý ngôn ngữ tự nhiên (NLP)</w:t>
-      </w:r>
-      <w:r>
-        <w:rPr>
-          <w:rFonts w:cs="Times New Roman"/>
-          <w:szCs w:val="26"/>
-          <w:lang w:val="vi-VN"/>
-        </w:rPr>
-        <w:t>;</w:t>
-      </w:r>
-    </w:p>
-    <w:p>
-      <w:pPr>
-        <w:pStyle w:val="ListParagraph"/>
-        <w:numPr>
-          <w:ilvl w:val="0"/>
-          <w:numId w:val="7"/>
-        </w:numPr>
-        <w:rPr>
-          <w:rFonts w:cs="Times New Roman"/>
-          <w:szCs w:val="26"/>
-        </w:rPr>
-      </w:pPr>
-      <w:r>
-        <w:rPr>
-          <w:rFonts w:cs="Times New Roman"/>
-          <w:szCs w:val="26"/>
-        </w:rPr>
-        <w:lastRenderedPageBreak/>
-        <w:t>Mô hình RAG và vector database</w:t>
-      </w:r>
-      <w:r>
-        <w:rPr>
-          <w:rFonts w:cs="Times New Roman"/>
-          <w:szCs w:val="26"/>
-        </w:rPr>
-        <w:t>;</w:t>
-      </w:r>
-    </w:p>
-    <w:p>
-      <w:pPr>
-        <w:pStyle w:val="ListParagraph"/>
-        <w:numPr>
-          <w:ilvl w:val="0"/>
-          <w:numId w:val="7"/>
-        </w:numPr>
-        <w:rPr>
-          <w:rFonts w:cs="Times New Roman"/>
-          <w:szCs w:val="26"/>
-        </w:rPr>
-      </w:pPr>
-      <w:r>
-        <w:rPr>
-          <w:rFonts w:cs="Times New Roman"/>
-          <w:szCs w:val="26"/>
-        </w:rPr>
-        <w:t>Hệ thống chatbot tương tác ngườ</w:t>
-      </w:r>
-      <w:r>
-        <w:rPr>
-          <w:rFonts w:cs="Times New Roman"/>
-          <w:szCs w:val="26"/>
-        </w:rPr>
-        <w:t>i dùng</w:t>
-      </w:r>
-      <w:r>
-        <w:rPr>
-          <w:rFonts w:cs="Times New Roman"/>
-          <w:szCs w:val="26"/>
-        </w:rPr>
-        <w:t>.</w:t>
-      </w:r>
-    </w:p>
-    <w:p>
-      <w:pPr>
-        <w:spacing w:after="0" w:line="360" w:lineRule="auto"/>
-        <w:jc w:val="both"/>
-        <w:rPr>
-          <w:rFonts w:cs="Times New Roman"/>
-          <w:b/>
-          <w:i/>
-          <w:szCs w:val="26"/>
-        </w:rPr>
-      </w:pPr>
-      <w:r>
-        <w:rPr>
-          <w:rFonts w:cs="Times New Roman"/>
-          <w:b/>
-          <w:i/>
-          <w:szCs w:val="26"/>
-        </w:rPr>
-        <w:t>Phạm vi nghiên cứu:</w:t>
-      </w:r>
-    </w:p>
-    <w:p>
-      <w:pPr>
-        <w:pStyle w:val="ListParagraph"/>
-        <w:numPr>
-          <w:ilvl w:val="0"/>
-          <w:numId w:val="12"/>
-        </w:numPr>
-        <w:rPr>
-          <w:rFonts w:cs="Times New Roman"/>
-          <w:szCs w:val="26"/>
-          <w:lang w:val="vi-VN"/>
-        </w:rPr>
-      </w:pPr>
-      <w:r>
-        <w:rPr>
-          <w:rFonts w:cs="Times New Roman"/>
-          <w:szCs w:val="26"/>
-          <w:lang w:val="vi-VN"/>
-        </w:rPr>
-        <w:t>Tập trung vào tra cứu thủ tục hành chính cấp tỉnh/cấp trung ương</w:t>
-      </w:r>
-      <w:r>
-        <w:rPr>
-          <w:rFonts w:cs="Times New Roman"/>
-          <w:szCs w:val="26"/>
-          <w:lang w:val="vi-VN"/>
-        </w:rPr>
-        <w:t>;</w:t>
-      </w:r>
-    </w:p>
-    <w:p>
-      <w:pPr>
-        <w:pStyle w:val="ListParagraph"/>
-        <w:numPr>
-          <w:ilvl w:val="0"/>
-          <w:numId w:val="12"/>
-        </w:numPr>
-        <w:rPr>
-          <w:rFonts w:cs="Times New Roman"/>
-          <w:szCs w:val="26"/>
-          <w:lang w:val="vi-VN"/>
-        </w:rPr>
-      </w:pPr>
-      <w:r>
-        <w:rPr>
-          <w:rFonts w:cs="Times New Roman"/>
-          <w:szCs w:val="26"/>
-          <w:lang w:val="vi-VN"/>
-        </w:rPr>
-        <w:t>Dữ liệu đầu vào được thu thập từ cổng dịch vụ công</w:t>
-      </w:r>
-      <w:r>
-        <w:rPr>
-          <w:rFonts w:cs="Times New Roman"/>
-          <w:szCs w:val="26"/>
-          <w:lang w:val="vi-VN"/>
-        </w:rPr>
-        <w:t>;</w:t>
-      </w:r>
-    </w:p>
-    <w:p>
-      <w:pPr>
-        <w:pStyle w:val="ListParagraph"/>
-        <w:numPr>
-          <w:ilvl w:val="0"/>
-          <w:numId w:val="12"/>
-        </w:numPr>
-        <w:rPr>
-          <w:rFonts w:cs="Times New Roman"/>
-          <w:szCs w:val="26"/>
-          <w:lang w:val="vi-VN"/>
-        </w:rPr>
-      </w:pPr>
-      <w:r>
-        <w:rPr>
-          <w:lang w:val="vi-VN"/>
-        </w:rPr>
-        <w:t>Tập trung vào nhóm thủ tục hành chính phổ biến (ví dụ: đất đai, tư pháp, hộ tịch) của tỉnh Lai Châu.</w:t>
-      </w:r>
-    </w:p>
-    <w:p>
-      <w:pPr>
-        <w:pStyle w:val="ListParagraph"/>
-        <w:numPr>
-          <w:ilvl w:val="0"/>
-          <w:numId w:val="12"/>
-        </w:numPr>
-        <w:rPr>
-          <w:rFonts w:cs="Times New Roman"/>
-          <w:szCs w:val="26"/>
-          <w:lang w:val="vi-VN"/>
-        </w:rPr>
-      </w:pPr>
-      <w:r>
-        <w:rPr>
-          <w:rFonts w:cs="Times New Roman"/>
-          <w:szCs w:val="26"/>
-          <w:lang w:val="vi-VN"/>
-        </w:rPr>
-        <w:t>Hệ thống chỉ xử lý văn bản, chưa xử lý giọng nói</w:t>
-      </w:r>
-      <w:r>
-        <w:rPr>
-          <w:rFonts w:cs="Times New Roman"/>
-          <w:szCs w:val="26"/>
-          <w:lang w:val="vi-VN"/>
-        </w:rPr>
-        <w:t>;</w:t>
-      </w:r>
-    </w:p>
-    <w:p>
-      <w:pPr>
-        <w:pStyle w:val="ListParagraph"/>
-        <w:numPr>
-          <w:ilvl w:val="0"/>
-          <w:numId w:val="12"/>
-        </w:numPr>
-        <w:rPr>
-          <w:rFonts w:cs="Times New Roman"/>
-          <w:szCs w:val="26"/>
-        </w:rPr>
-      </w:pPr>
-      <w:r>
-        <w:rPr>
-          <w:rFonts w:cs="Times New Roman"/>
-          <w:szCs w:val="26"/>
-        </w:rPr>
-        <w:t>Không triển khai ở quy mô sản phẩm thương mại</w:t>
-      </w:r>
-      <w:r>
-        <w:rPr>
-          <w:rFonts w:cs="Times New Roman"/>
-          <w:szCs w:val="26"/>
-        </w:rPr>
-        <w:t>.</w:t>
-      </w:r>
-    </w:p>
-    <w:p>
-      <w:pPr>
-        <w:pStyle w:val="ListParagraph"/>
-        <w:numPr>
-          <w:ilvl w:val="0"/>
-          <w:numId w:val="6"/>
-        </w:numPr>
-        <w:ind w:left="357" w:hanging="357"/>
-        <w:outlineLvl w:val="1"/>
-        <w:rPr>
-          <w:b/>
-          <w:lang w:val="vi-VN"/>
-        </w:rPr>
-      </w:pPr>
-      <w:r>
-        <w:rPr>
-          <w:b/>
-        </w:rPr>
-        <w:t>Phương pháp nghiên cứu</w:t>
-      </w:r>
-    </w:p>
-    <w:p>
-      <w:pPr>
-        <w:pStyle w:val="ListParagraph"/>
-        <w:numPr>
-          <w:ilvl w:val="0"/>
-          <w:numId w:val="12"/>
-        </w:numPr>
-        <w:rPr>
-          <w:rFonts w:eastAsia="Times New Roman" w:cs="Times New Roman"/>
-          <w:szCs w:val="26"/>
-          <w:lang w:val="vi-VN"/>
-        </w:rPr>
-      </w:pPr>
-      <w:r>
-        <w:rPr>
-          <w:rFonts w:eastAsia="Times New Roman" w:cs="Times New Roman"/>
-          <w:szCs w:val="26"/>
-          <w:lang w:val="vi-VN"/>
-        </w:rPr>
-        <w:t xml:space="preserve">Phương pháp thu thập dữ liệu: </w:t>
-      </w:r>
-      <w:r>
-        <w:rPr>
-          <w:rFonts w:eastAsia="Times New Roman" w:cs="Times New Roman"/>
-          <w:szCs w:val="26"/>
-          <w:lang w:val="vi-VN"/>
-        </w:rPr>
-        <w:t>T</w:t>
-      </w:r>
-      <w:r>
-        <w:rPr>
-          <w:rFonts w:eastAsia="Times New Roman" w:cs="Times New Roman"/>
-          <w:szCs w:val="26"/>
-          <w:lang w:val="vi-VN"/>
-        </w:rPr>
-        <w:t>hu thập và chuẩn hóa dữ liệu thủ tục hành chính dạng JSON</w:t>
-      </w:r>
-      <w:r>
-        <w:rPr>
-          <w:rFonts w:eastAsia="Times New Roman" w:cs="Times New Roman"/>
-          <w:szCs w:val="26"/>
-          <w:lang w:val="vi-VN"/>
-        </w:rPr>
-        <w:t>;</w:t>
-      </w:r>
-    </w:p>
-    <w:p>
-      <w:pPr>
-        <w:pStyle w:val="ListParagraph"/>
-        <w:numPr>
-          <w:ilvl w:val="0"/>
-          <w:numId w:val="12"/>
-        </w:numPr>
-        <w:rPr>
-          <w:rFonts w:eastAsia="Times New Roman" w:cs="Times New Roman"/>
-          <w:szCs w:val="26"/>
-          <w:lang w:val="vi-VN"/>
-        </w:rPr>
-      </w:pPr>
-      <w:r>
-        <w:rPr>
-          <w:rFonts w:eastAsia="Times New Roman" w:cs="Times New Roman"/>
-          <w:szCs w:val="26"/>
-          <w:lang w:val="vi-VN"/>
-        </w:rPr>
-        <w:t xml:space="preserve">Phương pháp xử lý dữ liệu: </w:t>
-      </w:r>
-      <w:r>
-        <w:rPr>
-          <w:rFonts w:eastAsia="Times New Roman" w:cs="Times New Roman"/>
-          <w:szCs w:val="26"/>
-          <w:lang w:val="vi-VN"/>
-        </w:rPr>
-        <w:t>X</w:t>
-      </w:r>
-      <w:r>
-        <w:rPr>
-          <w:rFonts w:eastAsia="Times New Roman" w:cs="Times New Roman"/>
-          <w:szCs w:val="26"/>
-          <w:lang w:val="vi-VN"/>
-        </w:rPr>
-        <w:t>ây dựng cơ chế chunking theo từng trường thông tin (phí, hồ sơ, thời hạn,...)</w:t>
-      </w:r>
-      <w:r>
-        <w:rPr>
-          <w:rFonts w:eastAsia="Times New Roman" w:cs="Times New Roman"/>
-          <w:szCs w:val="26"/>
-          <w:lang w:val="vi-VN"/>
-        </w:rPr>
-        <w:t>;</w:t>
-      </w:r>
-    </w:p>
-    <w:p>
-      <w:pPr>
-        <w:pStyle w:val="ListParagraph"/>
-        <w:numPr>
-          <w:ilvl w:val="0"/>
-          <w:numId w:val="12"/>
-        </w:numPr>
-        <w:rPr>
-          <w:rFonts w:eastAsia="Times New Roman" w:cs="Times New Roman"/>
-          <w:szCs w:val="26"/>
-          <w:lang w:val="vi-VN"/>
-        </w:rPr>
-      </w:pPr>
-      <w:r>
-        <w:rPr>
-          <w:rFonts w:eastAsia="Times New Roman" w:cs="Times New Roman"/>
-          <w:szCs w:val="26"/>
-          <w:lang w:val="vi-VN"/>
-        </w:rPr>
-        <w:t xml:space="preserve">Phương pháp xây dựng hệ thống: </w:t>
-      </w:r>
-      <w:r>
-        <w:rPr>
-          <w:rFonts w:eastAsia="Times New Roman" w:cs="Times New Roman"/>
-          <w:szCs w:val="26"/>
-          <w:lang w:val="vi-VN"/>
-        </w:rPr>
-        <w:t>S</w:t>
-      </w:r>
-      <w:r>
-        <w:rPr>
-          <w:rFonts w:eastAsia="Times New Roman" w:cs="Times New Roman"/>
-          <w:szCs w:val="26"/>
-          <w:lang w:val="vi-VN"/>
-        </w:rPr>
-        <w:t>ử dụng kiến trúc RAG kết hợp vector database</w:t>
-      </w:r>
-      <w:r>
-        <w:rPr>
-          <w:rFonts w:eastAsia="Times New Roman" w:cs="Times New Roman"/>
-          <w:szCs w:val="26"/>
-          <w:lang w:val="vi-VN"/>
-        </w:rPr>
-        <w:t>;</w:t>
-      </w:r>
-    </w:p>
-    <w:p>
-      <w:pPr>
-        <w:pStyle w:val="ListParagraph"/>
-        <w:numPr>
-          <w:ilvl w:val="0"/>
-          <w:numId w:val="12"/>
-        </w:numPr>
-        <w:rPr>
-          <w:rFonts w:eastAsia="Times New Roman" w:cs="Times New Roman"/>
-          <w:szCs w:val="26"/>
-          <w:lang w:val="vi-VN"/>
-        </w:rPr>
-      </w:pPr>
-      <w:r>
-        <w:rPr>
-          <w:rFonts w:eastAsia="Times New Roman" w:cs="Times New Roman"/>
-          <w:szCs w:val="26"/>
-          <w:lang w:val="vi-VN"/>
-        </w:rPr>
-        <w:t xml:space="preserve">Phương pháp đánh giá: </w:t>
-      </w:r>
-      <w:r>
-        <w:rPr>
-          <w:rFonts w:eastAsia="Times New Roman" w:cs="Times New Roman"/>
-          <w:szCs w:val="26"/>
-          <w:lang w:val="vi-VN"/>
-        </w:rPr>
-        <w:t>K</w:t>
-      </w:r>
-      <w:r>
-        <w:rPr>
-          <w:rFonts w:eastAsia="Times New Roman" w:cs="Times New Roman"/>
-          <w:szCs w:val="26"/>
-          <w:lang w:val="vi-VN"/>
-        </w:rPr>
-        <w:t>iểm thử với các truy vấn thực tế và đo độ chính xác câu trả lời</w:t>
-      </w:r>
-      <w:r>
-        <w:rPr>
-          <w:rFonts w:eastAsia="Times New Roman" w:cs="Times New Roman"/>
-          <w:szCs w:val="26"/>
-          <w:lang w:val="vi-VN"/>
-        </w:rPr>
-        <w:t>.</w:t>
-      </w:r>
-    </w:p>
-    <w:p>
-      <w:pPr>
-        <w:pStyle w:val="ListParagraph"/>
-        <w:numPr>
-          <w:ilvl w:val="0"/>
-          <w:numId w:val="6"/>
-        </w:numPr>
-        <w:ind w:left="357" w:hanging="357"/>
-        <w:outlineLvl w:val="1"/>
-        <w:rPr>
-          <w:rFonts w:eastAsia="Times New Roman" w:cs="Times New Roman"/>
-          <w:szCs w:val="26"/>
-        </w:rPr>
-      </w:pPr>
-      <w:r>
-        <w:rPr>
-          <w:b/>
-        </w:rPr>
-        <w:t>Cấu trúc báo cáo</w:t>
-      </w:r>
-    </w:p>
-    <w:p>
-      <w:pPr>
-        <w:spacing w:after="0" w:line="360" w:lineRule="auto"/>
-        <w:jc w:val="both"/>
-        <w:rPr>
-          <w:rFonts w:cs="Times New Roman"/>
-          <w:b/>
-          <w:i/>
-          <w:szCs w:val="26"/>
-        </w:rPr>
-      </w:pPr>
-      <w:r>
-        <w:rPr>
-          <w:rFonts w:cs="Times New Roman"/>
-          <w:b/>
-          <w:i/>
-          <w:szCs w:val="26"/>
-        </w:rPr>
         <w:t>Báo cáo gồm các chương sau:</w:t>
       </w:r>
     </w:p>
@@ -1105,6 +1078,7 @@
           <w:szCs w:val="26"/>
           <w:lang w:val="vi-VN"/>
         </w:rPr>
+        <w:lastRenderedPageBreak/>
         <w:t xml:space="preserve">CHƯƠNG </w:t>
       </w:r>
       <w:r>
@@ -1127,25 +1101,7 @@
         <w:rPr>
           <w:lang w:val="vi-VN"/>
         </w:rPr>
-        <w:t xml:space="preserve"> </w:t>
-      </w:r>
-      <w:r>
-        <w:rPr>
-          <w:lang w:val="vi-VN"/>
-        </w:rPr>
-        <w:t>(Use Case</w:t>
-      </w:r>
-      <w:r>
-        <w:rPr>
-          <w:lang w:val="vi-VN"/>
-        </w:rPr>
-        <w:t xml:space="preserve">, </w:t>
-      </w:r>
-      <w:r>
-        <w:rPr>
-          <w:lang w:val="vi-VN"/>
-        </w:rPr>
-        <w:t>Kiế</w:t>
+        <w:t xml:space="preserve"> (Use Case, Kiế</w:t>
       </w:r>
       <w:r>
         <w:rPr>
@@ -1181,7 +1137,15 @@
           <w:szCs w:val="26"/>
           <w:lang w:val="vi-VN"/>
         </w:rPr>
-        <w:t>VI</w:t>
+        <w:t>I</w:t>
+      </w:r>
+      <w:r>
+        <w:rPr>
+          <w:rFonts w:eastAsia="Times New Roman" w:cs="Times New Roman"/>
+          <w:szCs w:val="26"/>
+          <w:lang w:val="vi-VN"/>
+        </w:rPr>
+        <w:t>V</w:t>
       </w:r>
       <w:r>
         <w:rPr>
@@ -1242,6 +1206,7 @@
         <w:rPr>
           <w:rFonts w:eastAsiaTheme="majorEastAsia" w:cs="Times New Roman"/>
           <w:szCs w:val="26"/>
+          <w:lang w:val="vi-VN"/>
         </w:rPr>
       </w:pPr>
       <w:r>
@@ -1249,6 +1214,7 @@
           <w:rFonts w:cs="Times New Roman"/>
           <w:i/>
           <w:szCs w:val="26"/>
+          <w:lang w:val="vi-VN"/>
         </w:rPr>
         <w:tab/>
       </w:r>
@@ -1257,15 +1223,9 @@
           <w:rFonts w:cs="Times New Roman"/>
           <w:i/>
           <w:szCs w:val="26"/>
+          <w:lang w:val="vi-VN"/>
         </w:rPr>
         <w:tab/>
-      </w:r>
-      <w:r>
-        <w:rPr>
-          <w:rFonts w:cs="Times New Roman"/>
-          <w:i/>
-          <w:szCs w:val="26"/>
-        </w:rPr>
         <w:t xml:space="preserve">                            </w:t>
       </w:r>
       <w:r>
@@ -1275,8 +1235,9 @@
           <w:bCs/>
           <w:i/>
           <w:szCs w:val="26"/>
-        </w:rPr>
-        <w:t xml:space="preserve">Thái </w:t>
+          <w:lang w:val="vi-VN"/>
+        </w:rPr>
+        <w:t>Thái Nguyên, ng</w:t>
       </w:r>
       <w:r>
         <w:rPr>
@@ -1285,8 +1246,9 @@
           <w:bCs/>
           <w:i/>
           <w:szCs w:val="26"/>
-        </w:rPr>
-        <w:t>Nguyên, ng</w:t>
+          <w:lang w:val="vi-VN"/>
+        </w:rPr>
+        <w:t xml:space="preserve">ày  tháng </w:t>
       </w:r>
       <w:r>
         <w:rPr>
@@ -1295,16 +1257,7 @@
           <w:bCs/>
           <w:i/>
           <w:szCs w:val="26"/>
-        </w:rPr>
-        <w:t xml:space="preserve">ày  tháng </w:t>
-      </w:r>
-      <w:r>
-        <w:rPr>
-          <w:rFonts w:cs="Times New Roman"/>
-          <w:b/>
-          <w:bCs/>
-          <w:i/>
-          <w:szCs w:val="26"/>
+          <w:lang w:val="vi-VN"/>
         </w:rPr>
         <w:t xml:space="preserve"> năm 2026</w:t>
       </w:r>
@@ -1325,6 +1278,7 @@
         <w:rPr>
           <w:sz w:val="26"/>
           <w:szCs w:val="26"/>
+          <w:lang w:val="vi-VN"/>
         </w:rPr>
       </w:pPr>
       <w:r>
@@ -1340,6 +1294,7 @@
         <w:rPr>
           <w:sz w:val="26"/>
           <w:szCs w:val="26"/>
+          <w:lang w:val="vi-VN"/>
         </w:rPr>
         <w:t xml:space="preserve">HƯƠNG 1. </w:t>
       </w:r>
@@ -1347,6 +1302,7 @@
         <w:rPr>
           <w:sz w:val="26"/>
           <w:szCs w:val="26"/>
+          <w:lang w:val="vi-VN"/>
         </w:rPr>
         <w:t xml:space="preserve">TỔNG QUAN VỀ ĐỀ TÀI VÀ </w:t>
       </w:r>
@@ -1354,6 +1310,7 @@
         <w:rPr>
           <w:sz w:val="26"/>
           <w:szCs w:val="26"/>
+          <w:lang w:val="vi-VN"/>
         </w:rPr>
         <w:t>CƠ SỞ LÝ THUYẾT</w:t>
       </w:r>
@@ -1414,6 +1371,7 @@
         <w:rPr>
           <w:rFonts w:cs="Times New Roman"/>
           <w:szCs w:val="26"/>
+          <w:lang w:val="vi-VN"/>
         </w:rPr>
       </w:pPr>
       <w:r>
@@ -1435,12 +1393,14 @@
         <w:rPr>
           <w:rFonts w:cs="Times New Roman"/>
           <w:szCs w:val="26"/>
-        </w:rPr>
-      </w:pPr>
-      <w:r>
-        <w:rPr>
-          <w:rFonts w:cs="Times New Roman"/>
-          <w:szCs w:val="26"/>
+          <w:lang w:val="vi-VN"/>
+        </w:rPr>
+      </w:pPr>
+      <w:r>
+        <w:rPr>
+          <w:rFonts w:cs="Times New Roman"/>
+          <w:szCs w:val="26"/>
+          <w:lang w:val="vi-VN"/>
         </w:rPr>
         <w:t>Tùy theo mức độ thông minh, chatbot có thể được chia thành hai loại chính:</w:t>
       </w:r>
@@ -1455,12 +1415,14 @@
         <w:rPr>
           <w:rFonts w:cs="Times New Roman"/>
           <w:szCs w:val="26"/>
-        </w:rPr>
-      </w:pPr>
-      <w:r>
-        <w:rPr>
-          <w:rFonts w:cs="Times New Roman"/>
-          <w:szCs w:val="26"/>
+          <w:lang w:val="vi-VN"/>
+        </w:rPr>
+      </w:pPr>
+      <w:r>
+        <w:rPr>
+          <w:rFonts w:cs="Times New Roman"/>
+          <w:szCs w:val="26"/>
+          <w:lang w:val="vi-VN"/>
         </w:rPr>
         <w:t>Rule-based Chatbot: hoạt động dựa trên kịch bản và luật định nghĩa sẵn.</w:t>
       </w:r>
@@ -1475,12 +1437,14 @@
         <w:rPr>
           <w:rFonts w:cs="Times New Roman"/>
           <w:szCs w:val="26"/>
-        </w:rPr>
-      </w:pPr>
-      <w:r>
-        <w:rPr>
-          <w:rFonts w:cs="Times New Roman"/>
-          <w:szCs w:val="26"/>
+          <w:lang w:val="vi-VN"/>
+        </w:rPr>
+      </w:pPr>
+      <w:r>
+        <w:rPr>
+          <w:rFonts w:cs="Times New Roman"/>
+          <w:szCs w:val="26"/>
+          <w:lang w:val="vi-VN"/>
         </w:rPr>
         <w:t>AI-based Chatbot: sử dụng các mô hình học máy và xử lý ngôn ngữ tự nhiên để hiểu và phản hồi linh hoạt.</w:t>
       </w:r>
@@ -1563,6 +1527,7 @@
         <w:rPr>
           <w:rFonts w:cs="Times New Roman"/>
           <w:szCs w:val="26"/>
+          <w:lang w:val="vi-VN"/>
         </w:rPr>
       </w:pPr>
       <w:r>
@@ -1584,12 +1549,14 @@
         <w:rPr>
           <w:rFonts w:cs="Times New Roman"/>
           <w:szCs w:val="26"/>
-        </w:rPr>
-      </w:pPr>
-      <w:r>
-        <w:rPr>
-          <w:rFonts w:cs="Times New Roman"/>
-          <w:szCs w:val="26"/>
+          <w:lang w:val="vi-VN"/>
+        </w:rPr>
+      </w:pPr>
+      <w:r>
+        <w:rPr>
+          <w:rFonts w:cs="Times New Roman"/>
+          <w:szCs w:val="26"/>
+          <w:lang w:val="vi-VN"/>
         </w:rPr>
         <w:t>Cơ chế hoạt động cốt lõi của LLM là dự đoán token tiếp theo dựa trên chuỗi token trước đó. Nhờ vậy, mô hình có thể sinh ra các câu trả lời có tính mạch lạc và phù hợp ngữ cảnh.</w:t>
       </w:r>
@@ -1604,12 +1571,14 @@
         <w:rPr>
           <w:rFonts w:cs="Times New Roman"/>
           <w:szCs w:val="26"/>
-        </w:rPr>
-      </w:pPr>
-      <w:r>
-        <w:rPr>
-          <w:rFonts w:cs="Times New Roman"/>
-          <w:szCs w:val="26"/>
+          <w:lang w:val="vi-VN"/>
+        </w:rPr>
+      </w:pPr>
+      <w:r>
+        <w:rPr>
+          <w:rFonts w:cs="Times New Roman"/>
+          <w:szCs w:val="26"/>
+          <w:lang w:val="vi-VN"/>
         </w:rPr>
         <w:t>Tuy nhiên, LLM tồn tại một số hạn chế quan trọng:</w:t>
       </w:r>
@@ -1624,12 +1593,14 @@
         <w:rPr>
           <w:rFonts w:cs="Times New Roman"/>
           <w:szCs w:val="26"/>
-        </w:rPr>
-      </w:pPr>
-      <w:r>
-        <w:rPr>
-          <w:rFonts w:cs="Times New Roman"/>
-          <w:szCs w:val="26"/>
+          <w:lang w:val="vi-VN"/>
+        </w:rPr>
+      </w:pPr>
+      <w:r>
+        <w:rPr>
+          <w:rFonts w:cs="Times New Roman"/>
+          <w:szCs w:val="26"/>
+          <w:lang w:val="vi-VN"/>
         </w:rPr>
         <w:t>Kiến thức có thể bị lỗi thời do phụ thuộc vào dữ liệu huấn luyện.</w:t>
       </w:r>
@@ -1759,12 +1730,14 @@
         <w:rPr>
           <w:rFonts w:cs="Times New Roman"/>
           <w:szCs w:val="26"/>
-        </w:rPr>
-      </w:pPr>
-      <w:r>
-        <w:rPr>
-          <w:rFonts w:cs="Times New Roman"/>
-          <w:szCs w:val="26"/>
+          <w:lang w:val="vi-VN"/>
+        </w:rPr>
+      </w:pPr>
+      <w:r>
+        <w:rPr>
+          <w:rFonts w:cs="Times New Roman"/>
+          <w:szCs w:val="26"/>
+          <w:lang w:val="vi-VN"/>
         </w:rPr>
         <w:lastRenderedPageBreak/>
         <w:t xml:space="preserve">RAG hoạt động dựa trên nguyên lý "truy xuất trước, trả lời sau". Thay vì dựa hoàn toàn vào kiến thức nội tại của LLM, hệ thống sẽ tìm kiếm thông tin từ kho dữ liệu (backend/data/procedures.json) để cung cấp làm bằng chứng cho mô hình sinh câu trả lời. </w:t>
@@ -1914,14 +1887,7 @@
           <w:rFonts w:cs="Times New Roman"/>
           <w:szCs w:val="26"/>
         </w:rPr>
-        <w:t xml:space="preserve"> </w:t>
-      </w:r>
-      <w:r>
-        <w:rPr>
-          <w:rFonts w:cs="Times New Roman"/>
-          <w:szCs w:val="26"/>
-        </w:rPr>
-        <w:t>Mỗi chunk được lưu dưới dạng:</w:t>
+        <w:t xml:space="preserve"> Mỗi chunk được lưu dưới dạng:</w:t>
       </w:r>
     </w:p>
     <w:p>
@@ -1937,10 +1903,7 @@
         </w:rPr>
       </w:pPr>
       <w:r>
-        <w:t>page_content: nội dung văn bả</w:t>
-      </w:r>
-      <w:r>
-        <w:t>n</w:t>
+        <w:t>page_content: nội dung văn bản</w:t>
       </w:r>
     </w:p>
     <w:p>
@@ -1999,23 +1962,7 @@
           <w:szCs w:val="26"/>
           <w:lang w:val="vi-VN"/>
         </w:rPr>
-        <w:t>Sau khi được phân đoạn, các chunk văn bản được chuyển đổi thành vector số học thông qua mô hình embedding.</w:t>
-      </w:r>
-      <w:r>
-        <w:rPr>
-          <w:rFonts w:cs="Times New Roman"/>
-          <w:szCs w:val="26"/>
-          <w:lang w:val="vi-VN"/>
-        </w:rPr>
-        <w:t xml:space="preserve"> </w:t>
-      </w:r>
-      <w:r>
-        <w:rPr>
-          <w:rFonts w:cs="Times New Roman"/>
-          <w:szCs w:val="26"/>
-          <w:lang w:val="vi-VN"/>
-        </w:rPr>
-        <w:t>Vector embedding cho phép biểu diễn ý nghĩa ngữ nghĩa của văn bản dưới dạng số, giúp hệ thống có thể:</w:t>
+        <w:t>Sau khi được phân đoạn, các chunk văn bản được chuyển đổi thành vector số học thông qua mô hình embedding. Vector embedding cho phép biểu diễn ý nghĩa ngữ nghĩa của văn bản dưới dạng số, giúp hệ thống có thể:</w:t>
       </w:r>
     </w:p>
     <w:p>
@@ -2232,10 +2179,7 @@
         <w:jc w:val="both"/>
       </w:pPr>
       <w:r>
-        <w:t xml:space="preserve">Google Cloud Platform (GCP): </w:t>
-      </w:r>
-      <w:r>
-        <w:t>Hệ thống được triển khai trên nền tảng Google Cloud nhằm đảm bảo khả năng mở rộng, tính ổn định và hiệu năng. Backend FastAPI có thể được deploy thông qua các dịch vụ như Cloud Run hoặc Compute Engine, trong khi frontend được triển khai dưới dạng static site.</w:t>
+        <w:t>Google Cloud Platform (GCP): Hệ thống được triển khai trên nền tảng Google Cloud nhằm đảm bảo khả năng mở rộng, tính ổn định và hiệu năng. Backend FastAPI có thể được deploy thông qua các dịch vụ như Cloud Run hoặc Compute Engine, trong khi frontend được triển khai dưới dạng static site.</w:t>
       </w:r>
     </w:p>
     <w:p>
@@ -2243,10 +2187,7 @@
         <w:jc w:val="both"/>
       </w:pPr>
       <w:r>
-        <w:t>F</w:t>
-      </w:r>
-      <w:r>
-        <w:t>irebase (Hosting và Firestore):</w:t>
+        <w:t>Firebase (Hosting và Firestore):</w:t>
       </w:r>
       <w:r>
         <w:rPr>
@@ -2283,6 +2224,9 @@
           <w:ilvl w:val="0"/>
           <w:numId w:val="23"/>
         </w:numPr>
+        <w:rPr>
+          <w:lang w:val="vi-VN"/>
+        </w:rPr>
       </w:pPr>
       <w:r>
         <w:rPr>
@@ -2291,6 +2235,9 @@
         <w:t xml:space="preserve">Firebase Firestore: được sử dụng làm cơ sở dữ liệu NoSQL để lưu trữ lịch sử hội thoại (Chat History) giữa người dùng và chatbot. </w:t>
       </w:r>
       <w:r>
+        <w:rPr>
+          <w:lang w:val="vi-VN"/>
+        </w:rPr>
         <w:t>Firestore cho phép lưu trữ dữ liệu dạng document linh hoạt, phù hợp với cấu trúc hội thoại và dễ dàng mở rộng.</w:t>
       </w:r>
     </w:p>
@@ -2321,7 +2268,6 @@
         <w:rPr>
           <w:rFonts w:cs="Times New Roman"/>
           <w:szCs w:val="26"/>
-          <w:lang w:val="en-US"/>
         </w:rPr>
         <w:t xml:space="preserve"> </w:t>
       </w:r>
@@ -2361,14 +2307,7 @@
           <w:rFonts w:cs="Times New Roman"/>
           <w:szCs w:val="26"/>
         </w:rPr>
-        <w:t xml:space="preserve"> </w:t>
-      </w:r>
-      <w:r>
-        <w:rPr>
-          <w:rFonts w:cs="Times New Roman"/>
-          <w:szCs w:val="26"/>
-        </w:rPr>
-        <w:t>Hệ thống tích hợp mô hình ngôn ngữ lớn thông qua API để sinh câu trả lời dựa trên dữ liệu đã truy xuất. Ngoài ra, cơ chế fallback được thiết kế để đảm bảo hệ thống vẫn hoạt động ổn định trong trường hợp mô hình chính gặp lỗi.</w:t>
+        <w:t xml:space="preserve"> Hệ thống tích hợp mô hình ngôn ngữ lớn thông qua API để sinh câu trả lời dựa trên dữ liệu đã truy xuất. Ngoài ra, cơ chế fallback được thiết kế để đảm bảo hệ thống vẫn hoạt động ổn định trong trường hợp mô hình chính gặp lỗi.</w:t>
       </w:r>
     </w:p>
     <w:p>
@@ -2385,16 +2324,7 @@
           <w:rFonts w:cs="Times New Roman"/>
           <w:szCs w:val="26"/>
         </w:rPr>
-        <w:t>Kiến trúc hệ thống được thiết kế theo hướng tách biệt f</w:t>
-      </w:r>
-      <w:bookmarkStart w:id="10" w:name="_GoBack"/>
-      <w:bookmarkEnd w:id="10"/>
-      <w:r>
-        <w:rPr>
-          <w:rFonts w:cs="Times New Roman"/>
-          <w:szCs w:val="26"/>
-        </w:rPr>
-        <w:t>rontend – backend – AI pipeline, giúp dễ dàng mở rộng và nâng cấp trong tương lai.</w:t>
+        <w:t>Kiến trúc hệ thống được thiết kế theo hướng tách biệt frontend – backend – AI pipeline, giúp dễ dàng mở rộng và nâng cấp trong tương lai.</w:t>
       </w:r>
     </w:p>
     <w:p>
@@ -6143,7 +6073,7 @@
 </file>
 
 <file path=customXml/itemProps1.xml><?xml version="1.0" encoding="utf-8"?>
-<ds:datastoreItem xmlns:ds="http://schemas.openxmlformats.org/officeDocument/2006/customXml" ds:itemID="{410E3C78-F8CE-4AA1-B5BE-87CAC06AAB2F}">
+<ds:datastoreItem xmlns:ds="http://schemas.openxmlformats.org/officeDocument/2006/customXml" ds:itemID="{ECC6757D-2469-439F-8003-9570264DD5F1}">
   <ds:schemaRefs>
     <ds:schemaRef ds:uri="http://schemas.openxmlformats.org/officeDocument/2006/bibliography"/>
   </ds:schemaRefs>

</xml_diff>